<commit_message>
feat: optimize network map with RF cell wedges, refine contract templates, and update smartw worker
</commit_message>
<xml_diff>
--- a/tvt3_v2/public/templates/PHU_LUC_CHUYEN_CHU_THE.docx
+++ b/tvt3_v2/public/templates/PHU_LUC_CHUYEN_CHU_THE.docx
@@ -912,7 +912,7 @@
           <w:sz w:val="26"/>
           <w:szCs w:val="26"/>
         </w:rPr>
-        <w:t>Địa chỉ: Số 236A Phan Trung, Phường Tam Hiệp, Tỉnh Đồng Nai, Việt Nam.</w:t>
+        <w:t>Địa chỉ: Số 236A Phan Trung, Phường Tam Hiệp, Đồng Nai, Việt Nam.</w:t>
       </w:r>
     </w:p>
     <w:p>
@@ -1223,7 +1223,7 @@
           <w:sz w:val="26"/>
           <w:szCs w:val="26"/>
         </w:rPr>
-        <w:t>Địa chỉ: Số 236A Phan Trung, Phường Tam Hiệp, Tỉnh Đồng Nai, Việt Nam</w:t>
+        <w:t>Địa chỉ: Số 236A Phan Trung, Phường Tam Hiệp, Đồng Nai, Việt Nam</w:t>
       </w:r>
       <w:r>
         <w:rPr>

</xml_diff>